<commit_message>
Update SummaryDashboard layout and add mfg certs warning
</commit_message>
<xml_diff>
--- a/Documentos/Cambios 8 de jul de 2026.docx
+++ b/Documentos/Cambios 8 de jul de 2026.docx
@@ -33,6 +33,65 @@
     <w:p>
       <w:pPr>
         <w:rPr>
+          <w:lang w:val="es-419"/>
+        </w:rPr>
+      </w:pPr>
+    </w:p>
+    <w:p>
+      <w:pPr>
+        <w:rPr>
+          <w:lang w:val="es-419"/>
+        </w:rPr>
+      </w:pPr>
+    </w:p>
+    <w:p>
+      <w:pPr>
+        <w:rPr>
+          <w:lang w:val="es-419"/>
+        </w:rPr>
+      </w:pPr>
+    </w:p>
+    <w:p>
+      <w:pPr>
+        <w:rPr>
+          <w:lang w:val="es-419"/>
+        </w:rPr>
+      </w:pPr>
+    </w:p>
+    <w:p>
+      <w:pPr>
+        <w:rPr>
+          <w:lang w:val="es-419"/>
+        </w:rPr>
+      </w:pPr>
+    </w:p>
+    <w:p>
+      <w:pPr>
+        <w:rPr>
+          <w:lang w:val="es-419"/>
+        </w:rPr>
+      </w:pPr>
+    </w:p>
+    <w:p>
+      <w:pPr>
+        <w:pBdr>
+          <w:bottom w:val="double" w:sz="6" w:space="1" w:color="auto"/>
+        </w:pBdr>
+        <w:rPr>
+          <w:lang w:val="es-419"/>
+        </w:rPr>
+      </w:pPr>
+    </w:p>
+    <w:p>
+      <w:pPr>
+        <w:rPr>
+          <w:lang w:val="es-419"/>
+        </w:rPr>
+      </w:pPr>
+    </w:p>
+    <w:p>
+      <w:pPr>
+        <w:rPr>
           <w:b/>
           <w:bCs/>
           <w:lang w:val="es-419"/>
@@ -440,7 +499,6 @@
           <w:noProof/>
           <w:lang w:val="es-419"/>
         </w:rPr>
-        <w:lastRenderedPageBreak/>
         <w:drawing>
           <wp:inline distT="0" distB="0" distL="0" distR="0" wp14:anchorId="5609A00A" wp14:editId="323D0025">
             <wp:extent cx="2228850" cy="4190238"/>
@@ -609,224 +667,224 @@
         <w:rPr>
           <w:lang w:val="es-419"/>
         </w:rPr>
+        <w:t>### Regla A: Existe Fecha de Sustancial</w:t>
+      </w:r>
+    </w:p>
+    <w:p>
+      <w:pPr>
+        <w:rPr>
+          <w:lang w:val="es-419"/>
+        </w:rPr>
+      </w:pPr>
+      <w:r>
+        <w:rPr>
+          <w:lang w:val="es-419"/>
+        </w:rPr>
+        <w:t>- Si el proyecto tiene una "Fecha de Sustancial" definida:</w:t>
+      </w:r>
+    </w:p>
+    <w:p>
+      <w:pPr>
+        <w:rPr>
+          <w:lang w:val="es-419"/>
+        </w:rPr>
+      </w:pPr>
+      <w:r>
+        <w:rPr>
+          <w:lang w:val="es-419"/>
+        </w:rPr>
+        <w:t>  - Comparar la fecha de vencimiento del documento contra la Fecha de Sustancial.</w:t>
+      </w:r>
+    </w:p>
+    <w:p>
+      <w:pPr>
+        <w:rPr>
+          <w:lang w:val="es-419"/>
+        </w:rPr>
+      </w:pPr>
+      <w:r>
+        <w:rPr>
+          <w:lang w:val="es-419"/>
+        </w:rPr>
+        <w:t>  - Si el documento estaba vigente en la Fecha de Sustancial, NO mostrar alerta.</w:t>
+      </w:r>
+    </w:p>
+    <w:p>
+      <w:pPr>
+        <w:rPr>
+          <w:lang w:val="es-419"/>
+        </w:rPr>
+      </w:pPr>
+      <w:r>
+        <w:rPr>
+          <w:lang w:val="es-419"/>
+        </w:rPr>
+        <w:t>  - Si el documento estaba vencido en la Fecha de Sustancial, mostrar alerta.</w:t>
+      </w:r>
+    </w:p>
+    <w:p>
+      <w:pPr>
+        <w:rPr>
+          <w:lang w:val="es-419"/>
+        </w:rPr>
+      </w:pPr>
+    </w:p>
+    <w:p>
+      <w:pPr>
+        <w:rPr>
+          <w:lang w:val="es-419"/>
+        </w:rPr>
+      </w:pPr>
+      <w:r>
+        <w:rPr>
+          <w:lang w:val="es-419"/>
+        </w:rPr>
+        <w:t>### Regla B: No existe Fecha de Sustancial</w:t>
+      </w:r>
+    </w:p>
+    <w:p>
+      <w:pPr>
+        <w:rPr>
+          <w:lang w:val="es-419"/>
+        </w:rPr>
+      </w:pPr>
+      <w:r>
+        <w:rPr>
+          <w:lang w:val="es-419"/>
+        </w:rPr>
+        <w:t>- Si el proyecto NO tiene Fecha de Sustancial:</w:t>
+      </w:r>
+    </w:p>
+    <w:p>
+      <w:pPr>
+        <w:rPr>
+          <w:lang w:val="es-419"/>
+        </w:rPr>
+      </w:pPr>
+      <w:r>
+        <w:rPr>
+          <w:lang w:val="es-419"/>
+        </w:rPr>
+        <w:t>  - Mostrar alerta únicamente cuando el documento esté vencido respecto a la fecha actual.</w:t>
+      </w:r>
+    </w:p>
+    <w:p>
+      <w:pPr>
+        <w:rPr>
+          <w:lang w:val="es-419"/>
+        </w:rPr>
+      </w:pPr>
+    </w:p>
+    <w:p>
+      <w:pPr>
+        <w:rPr>
+          <w:lang w:val="es-419"/>
+        </w:rPr>
+      </w:pPr>
+      <w:r>
+        <w:rPr>
+          <w:lang w:val="es-419"/>
+        </w:rPr>
+        <w:t>## 2. Añadir folders en la sección de archivos</w:t>
+      </w:r>
+    </w:p>
+    <w:p>
+      <w:pPr>
+        <w:rPr>
+          <w:lang w:val="es-419"/>
+        </w:rPr>
+      </w:pPr>
+    </w:p>
+    <w:p>
+      <w:pPr>
+        <w:rPr>
+          <w:lang w:val="es-419"/>
+        </w:rPr>
+      </w:pPr>
+      <w:r>
+        <w:rPr>
+          <w:lang w:val="es-419"/>
+        </w:rPr>
+        <w:t>En la sección de archivos del PACT:</w:t>
+      </w:r>
+    </w:p>
+    <w:p>
+      <w:pPr>
+        <w:rPr>
+          <w:lang w:val="es-419"/>
+        </w:rPr>
+      </w:pPr>
+    </w:p>
+    <w:p>
+      <w:pPr>
+        <w:rPr>
+          <w:lang w:val="es-419"/>
+        </w:rPr>
+      </w:pPr>
+      <w:r>
+        <w:rPr>
+          <w:lang w:val="es-419"/>
+        </w:rPr>
+        <w:t>- Permitir crear folders/carpetas nuevas.</w:t>
+      </w:r>
+    </w:p>
+    <w:p>
+      <w:pPr>
+        <w:rPr>
+          <w:lang w:val="es-419"/>
+        </w:rPr>
+      </w:pPr>
+      <w:r>
+        <w:rPr>
+          <w:lang w:val="es-419"/>
+        </w:rPr>
+        <w:t>- El usuario debe poder añadir folders que actualmente no existan.</w:t>
+      </w:r>
+    </w:p>
+    <w:p>
+      <w:pPr>
+        <w:rPr>
+          <w:lang w:val="es-419"/>
+        </w:rPr>
+      </w:pPr>
+      <w:r>
+        <w:rPr>
+          <w:lang w:val="es-419"/>
+        </w:rPr>
+        <w:t>- Validar nombres duplicados según las reglas existentes del sistema.</w:t>
+      </w:r>
+    </w:p>
+    <w:p>
+      <w:pPr>
+        <w:rPr>
+          <w:lang w:val="es-419"/>
+        </w:rPr>
+      </w:pPr>
+      <w:r>
+        <w:rPr>
+          <w:lang w:val="es-419"/>
+        </w:rPr>
+        <w:t>- Los nuevos folders deben aparecer inmediatamente en la estructura de archivos y quedar disponibles para almacenar documentos.</w:t>
+      </w:r>
+    </w:p>
+    <w:p>
+      <w:pPr>
+        <w:rPr>
+          <w:lang w:val="es-419"/>
+        </w:rPr>
+      </w:pPr>
+    </w:p>
+    <w:p>
+      <w:pPr>
+        <w:rPr>
+          <w:lang w:val="es-419"/>
+        </w:rPr>
+      </w:pPr>
+      <w:r>
+        <w:rPr>
+          <w:lang w:val="es-419"/>
+        </w:rPr>
         <w:lastRenderedPageBreak/>
-        <w:t>### Regla A: Existe Fecha de Sustancial</w:t>
-      </w:r>
-    </w:p>
-    <w:p>
-      <w:pPr>
-        <w:rPr>
-          <w:lang w:val="es-419"/>
-        </w:rPr>
-      </w:pPr>
-      <w:r>
-        <w:rPr>
-          <w:lang w:val="es-419"/>
-        </w:rPr>
-        <w:t>- Si el proyecto tiene una "Fecha de Sustancial" definida:</w:t>
-      </w:r>
-    </w:p>
-    <w:p>
-      <w:pPr>
-        <w:rPr>
-          <w:lang w:val="es-419"/>
-        </w:rPr>
-      </w:pPr>
-      <w:r>
-        <w:rPr>
-          <w:lang w:val="es-419"/>
-        </w:rPr>
-        <w:t>  - Comparar la fecha de vencimiento del documento contra la Fecha de Sustancial.</w:t>
-      </w:r>
-    </w:p>
-    <w:p>
-      <w:pPr>
-        <w:rPr>
-          <w:lang w:val="es-419"/>
-        </w:rPr>
-      </w:pPr>
-      <w:r>
-        <w:rPr>
-          <w:lang w:val="es-419"/>
-        </w:rPr>
-        <w:t>  - Si el documento estaba vigente en la Fecha de Sustancial, NO mostrar alerta.</w:t>
-      </w:r>
-    </w:p>
-    <w:p>
-      <w:pPr>
-        <w:rPr>
-          <w:lang w:val="es-419"/>
-        </w:rPr>
-      </w:pPr>
-      <w:r>
-        <w:rPr>
-          <w:lang w:val="es-419"/>
-        </w:rPr>
-        <w:t>  - Si el documento estaba vencido en la Fecha de Sustancial, mostrar alerta.</w:t>
-      </w:r>
-    </w:p>
-    <w:p>
-      <w:pPr>
-        <w:rPr>
-          <w:lang w:val="es-419"/>
-        </w:rPr>
-      </w:pPr>
-    </w:p>
-    <w:p>
-      <w:pPr>
-        <w:rPr>
-          <w:lang w:val="es-419"/>
-        </w:rPr>
-      </w:pPr>
-      <w:r>
-        <w:rPr>
-          <w:lang w:val="es-419"/>
-        </w:rPr>
-        <w:t>### Regla B: No existe Fecha de Sustancial</w:t>
-      </w:r>
-    </w:p>
-    <w:p>
-      <w:pPr>
-        <w:rPr>
-          <w:lang w:val="es-419"/>
-        </w:rPr>
-      </w:pPr>
-      <w:r>
-        <w:rPr>
-          <w:lang w:val="es-419"/>
-        </w:rPr>
-        <w:t>- Si el proyecto NO tiene Fecha de Sustancial:</w:t>
-      </w:r>
-    </w:p>
-    <w:p>
-      <w:pPr>
-        <w:rPr>
-          <w:lang w:val="es-419"/>
-        </w:rPr>
-      </w:pPr>
-      <w:r>
-        <w:rPr>
-          <w:lang w:val="es-419"/>
-        </w:rPr>
-        <w:t>  - Mostrar alerta únicamente cuando el documento esté vencido respecto a la fecha actual.</w:t>
-      </w:r>
-    </w:p>
-    <w:p>
-      <w:pPr>
-        <w:rPr>
-          <w:lang w:val="es-419"/>
-        </w:rPr>
-      </w:pPr>
-    </w:p>
-    <w:p>
-      <w:pPr>
-        <w:rPr>
-          <w:lang w:val="es-419"/>
-        </w:rPr>
-      </w:pPr>
-      <w:r>
-        <w:rPr>
-          <w:lang w:val="es-419"/>
-        </w:rPr>
-        <w:t>## 2. Añadir folders en la sección de archivos</w:t>
-      </w:r>
-    </w:p>
-    <w:p>
-      <w:pPr>
-        <w:rPr>
-          <w:lang w:val="es-419"/>
-        </w:rPr>
-      </w:pPr>
-    </w:p>
-    <w:p>
-      <w:pPr>
-        <w:rPr>
-          <w:lang w:val="es-419"/>
-        </w:rPr>
-      </w:pPr>
-      <w:r>
-        <w:rPr>
-          <w:lang w:val="es-419"/>
-        </w:rPr>
-        <w:t>En la sección de archivos del PACT:</w:t>
-      </w:r>
-    </w:p>
-    <w:p>
-      <w:pPr>
-        <w:rPr>
-          <w:lang w:val="es-419"/>
-        </w:rPr>
-      </w:pPr>
-    </w:p>
-    <w:p>
-      <w:pPr>
-        <w:rPr>
-          <w:lang w:val="es-419"/>
-        </w:rPr>
-      </w:pPr>
-      <w:r>
-        <w:rPr>
-          <w:lang w:val="es-419"/>
-        </w:rPr>
-        <w:t>- Permitir crear folders/carpetas nuevas.</w:t>
-      </w:r>
-    </w:p>
-    <w:p>
-      <w:pPr>
-        <w:rPr>
-          <w:lang w:val="es-419"/>
-        </w:rPr>
-      </w:pPr>
-      <w:r>
-        <w:rPr>
-          <w:lang w:val="es-419"/>
-        </w:rPr>
-        <w:t>- El usuario debe poder añadir folders que actualmente no existan.</w:t>
-      </w:r>
-    </w:p>
-    <w:p>
-      <w:pPr>
-        <w:rPr>
-          <w:lang w:val="es-419"/>
-        </w:rPr>
-      </w:pPr>
-      <w:r>
-        <w:rPr>
-          <w:lang w:val="es-419"/>
-        </w:rPr>
-        <w:t>- Validar nombres duplicados según las reglas existentes del sistema.</w:t>
-      </w:r>
-    </w:p>
-    <w:p>
-      <w:pPr>
-        <w:rPr>
-          <w:lang w:val="es-419"/>
-        </w:rPr>
-      </w:pPr>
-      <w:r>
-        <w:rPr>
-          <w:lang w:val="es-419"/>
-        </w:rPr>
-        <w:t>- Los nuevos folders deben aparecer inmediatamente en la estructura de archivos y quedar disponibles para almacenar documentos.</w:t>
-      </w:r>
-    </w:p>
-    <w:p>
-      <w:pPr>
-        <w:rPr>
-          <w:lang w:val="es-419"/>
-        </w:rPr>
-      </w:pPr>
-    </w:p>
-    <w:p>
-      <w:pPr>
-        <w:rPr>
-          <w:lang w:val="es-419"/>
-        </w:rPr>
-      </w:pPr>
-      <w:r>
-        <w:rPr>
-          <w:lang w:val="es-419"/>
-        </w:rPr>
         <w:t>## 3. Certificación pagada al contratista</w:t>
       </w:r>
     </w:p>
@@ -1168,6 +1226,7 @@
         <w:rPr>
           <w:lang w:val="es-419"/>
         </w:rPr>
+        <w:lastRenderedPageBreak/>
         <w:t>En el widget/panel "Change Orders" mostrado en el Resumen del proyecto:</w:t>
       </w:r>
     </w:p>
@@ -1199,11 +1258,673 @@
       </w:pPr>
     </w:p>
     <w:p>
-      <w:r>
-        <w:t>### Material On Site</w:t>
-      </w:r>
-    </w:p>
-    <w:p/>
+      <w:pPr>
+        <w:rPr>
+          <w:lang w:val="es-419"/>
+        </w:rPr>
+      </w:pPr>
+      <w:r>
+        <w:rPr>
+          <w:lang w:val="es-419"/>
+        </w:rPr>
+        <w:t xml:space="preserve">### Material </w:t>
+      </w:r>
+      <w:proofErr w:type="spellStart"/>
+      <w:r>
+        <w:rPr>
+          <w:lang w:val="es-419"/>
+        </w:rPr>
+        <w:t>On</w:t>
+      </w:r>
+      <w:proofErr w:type="spellEnd"/>
+      <w:r>
+        <w:rPr>
+          <w:lang w:val="es-419"/>
+        </w:rPr>
+        <w:t xml:space="preserve"> Site</w:t>
+      </w:r>
+    </w:p>
+    <w:p>
+      <w:pPr>
+        <w:rPr>
+          <w:lang w:val="es-419"/>
+        </w:rPr>
+      </w:pPr>
+    </w:p>
+    <w:p>
+      <w:pPr>
+        <w:rPr>
+          <w:lang w:val="es-419"/>
+        </w:rPr>
+      </w:pPr>
+      <w:r>
+        <w:rPr>
+          <w:lang w:val="es-419"/>
+        </w:rPr>
+        <w:t>Mostrar los siguientes valores:</w:t>
+      </w:r>
+    </w:p>
+    <w:p>
+      <w:pPr>
+        <w:rPr>
+          <w:lang w:val="es-419"/>
+        </w:rPr>
+      </w:pPr>
+    </w:p>
+    <w:p>
+      <w:pPr>
+        <w:rPr>
+          <w:lang w:val="es-419"/>
+        </w:rPr>
+      </w:pPr>
+      <w:r>
+        <w:rPr>
+          <w:lang w:val="es-419"/>
+        </w:rPr>
+        <w:t xml:space="preserve">1. Balance de Material </w:t>
+      </w:r>
+      <w:proofErr w:type="spellStart"/>
+      <w:r>
+        <w:rPr>
+          <w:lang w:val="es-419"/>
+        </w:rPr>
+        <w:t>On</w:t>
+      </w:r>
+      <w:proofErr w:type="spellEnd"/>
+      <w:r>
+        <w:rPr>
+          <w:lang w:val="es-419"/>
+        </w:rPr>
+        <w:t xml:space="preserve"> Site Pagado Hasta la Fecha</w:t>
+      </w:r>
+    </w:p>
+    <w:p>
+      <w:pPr>
+        <w:rPr>
+          <w:lang w:val="es-419"/>
+        </w:rPr>
+      </w:pPr>
+      <w:r>
+        <w:rPr>
+          <w:lang w:val="es-419"/>
+        </w:rPr>
+        <w:t xml:space="preserve">2. Último Material </w:t>
+      </w:r>
+      <w:proofErr w:type="spellStart"/>
+      <w:r>
+        <w:rPr>
+          <w:lang w:val="es-419"/>
+        </w:rPr>
+        <w:t>On</w:t>
+      </w:r>
+      <w:proofErr w:type="spellEnd"/>
+      <w:r>
+        <w:rPr>
+          <w:lang w:val="es-419"/>
+        </w:rPr>
+        <w:t xml:space="preserve"> Site Pagado</w:t>
+      </w:r>
+    </w:p>
+    <w:p>
+      <w:pPr>
+        <w:rPr>
+          <w:lang w:val="es-419"/>
+        </w:rPr>
+      </w:pPr>
+      <w:r>
+        <w:rPr>
+          <w:lang w:val="es-419"/>
+        </w:rPr>
+        <w:t xml:space="preserve">3. Balance Actual de Material </w:t>
+      </w:r>
+      <w:proofErr w:type="spellStart"/>
+      <w:r>
+        <w:rPr>
+          <w:lang w:val="es-419"/>
+        </w:rPr>
+        <w:t>On</w:t>
+      </w:r>
+      <w:proofErr w:type="spellEnd"/>
+      <w:r>
+        <w:rPr>
+          <w:lang w:val="es-419"/>
+        </w:rPr>
+        <w:t xml:space="preserve"> Site</w:t>
+      </w:r>
+    </w:p>
+    <w:p>
+      <w:pPr>
+        <w:rPr>
+          <w:lang w:val="es-419"/>
+        </w:rPr>
+      </w:pPr>
+    </w:p>
+    <w:p>
+      <w:pPr>
+        <w:rPr>
+          <w:lang w:val="es-419"/>
+        </w:rPr>
+      </w:pPr>
+      <w:r>
+        <w:rPr>
+          <w:lang w:val="es-419"/>
+        </w:rPr>
+        <w:t>Formato requerido:</w:t>
+      </w:r>
+    </w:p>
+    <w:p>
+      <w:pPr>
+        <w:rPr>
+          <w:lang w:val="es-419"/>
+        </w:rPr>
+      </w:pPr>
+      <w:r>
+        <w:rPr>
+          <w:lang w:val="es-419"/>
+        </w:rPr>
+        <w:t>- Mantener el mismo estilo visual del panel.</w:t>
+      </w:r>
+    </w:p>
+    <w:p>
+      <w:pPr>
+        <w:rPr>
+          <w:lang w:val="es-419"/>
+        </w:rPr>
+      </w:pPr>
+      <w:r>
+        <w:rPr>
+          <w:lang w:val="es-419"/>
+        </w:rPr>
+        <w:t>- Mostrar cantidades monetarias utilizando el formato actual del sistema.</w:t>
+      </w:r>
+    </w:p>
+    <w:p>
+      <w:pPr>
+        <w:rPr>
+          <w:lang w:val="es-419"/>
+        </w:rPr>
+      </w:pPr>
+      <w:r>
+        <w:rPr>
+          <w:lang w:val="es-419"/>
+        </w:rPr>
+        <w:t xml:space="preserve">- Incluir alineación y espaciado consistente con el resto de </w:t>
+      </w:r>
+      <w:proofErr w:type="gramStart"/>
+      <w:r>
+        <w:rPr>
+          <w:lang w:val="es-419"/>
+        </w:rPr>
+        <w:t>indicadores</w:t>
+      </w:r>
+      <w:proofErr w:type="gramEnd"/>
+      <w:r>
+        <w:rPr>
+          <w:lang w:val="es-419"/>
+        </w:rPr>
+        <w:t xml:space="preserve"> financieros.</w:t>
+      </w:r>
+    </w:p>
+    <w:p>
+      <w:pPr>
+        <w:rPr>
+          <w:lang w:val="es-419"/>
+        </w:rPr>
+      </w:pPr>
+    </w:p>
+    <w:p>
+      <w:pPr>
+        <w:rPr>
+          <w:lang w:val="es-419"/>
+        </w:rPr>
+      </w:pPr>
+      <w:r>
+        <w:rPr>
+          <w:lang w:val="es-419"/>
+        </w:rPr>
+        <w:t>Ejemplo de estructura visual:</w:t>
+      </w:r>
+    </w:p>
+    <w:p>
+      <w:pPr>
+        <w:rPr>
+          <w:lang w:val="es-419"/>
+        </w:rPr>
+      </w:pPr>
+    </w:p>
+    <w:p>
+      <w:pPr>
+        <w:rPr>
+          <w:lang w:val="es-419"/>
+        </w:rPr>
+      </w:pPr>
+      <w:r>
+        <w:rPr>
+          <w:lang w:val="es-419"/>
+        </w:rPr>
+        <w:t xml:space="preserve">Material </w:t>
+      </w:r>
+      <w:proofErr w:type="spellStart"/>
+      <w:r>
+        <w:rPr>
+          <w:lang w:val="es-419"/>
+        </w:rPr>
+        <w:t>On</w:t>
+      </w:r>
+      <w:proofErr w:type="spellEnd"/>
+      <w:r>
+        <w:rPr>
+          <w:lang w:val="es-419"/>
+        </w:rPr>
+        <w:t xml:space="preserve"> Site</w:t>
+      </w:r>
+    </w:p>
+    <w:p>
+      <w:pPr>
+        <w:rPr>
+          <w:lang w:val="es-419"/>
+        </w:rPr>
+      </w:pPr>
+    </w:p>
+    <w:p>
+      <w:pPr>
+        <w:rPr>
+          <w:lang w:val="es-419"/>
+        </w:rPr>
+      </w:pPr>
+      <w:r>
+        <w:rPr>
+          <w:lang w:val="es-419"/>
+        </w:rPr>
+        <w:t>Balance Pagado Hasta la Fecha:</w:t>
+      </w:r>
+    </w:p>
+    <w:p>
+      <w:pPr>
+        <w:rPr>
+          <w:lang w:val="es-419"/>
+        </w:rPr>
+      </w:pPr>
+      <w:r>
+        <w:rPr>
+          <w:lang w:val="es-419"/>
+        </w:rPr>
+        <w:t>$</w:t>
+      </w:r>
+      <w:proofErr w:type="gramStart"/>
+      <w:r>
+        <w:rPr>
+          <w:lang w:val="es-419"/>
+        </w:rPr>
+        <w:t>X,XXX</w:t>
+      </w:r>
+      <w:proofErr w:type="gramEnd"/>
+      <w:r>
+        <w:rPr>
+          <w:lang w:val="es-419"/>
+        </w:rPr>
+        <w:t>,XXX.XX</w:t>
+      </w:r>
+    </w:p>
+    <w:p>
+      <w:pPr>
+        <w:rPr>
+          <w:lang w:val="es-419"/>
+        </w:rPr>
+      </w:pPr>
+    </w:p>
+    <w:p>
+      <w:pPr>
+        <w:rPr>
+          <w:lang w:val="es-419"/>
+        </w:rPr>
+      </w:pPr>
+      <w:r>
+        <w:rPr>
+          <w:lang w:val="es-419"/>
+        </w:rPr>
+        <w:t xml:space="preserve">Último Material </w:t>
+      </w:r>
+      <w:proofErr w:type="spellStart"/>
+      <w:r>
+        <w:rPr>
+          <w:lang w:val="es-419"/>
+        </w:rPr>
+        <w:t>On</w:t>
+      </w:r>
+      <w:proofErr w:type="spellEnd"/>
+      <w:r>
+        <w:rPr>
+          <w:lang w:val="es-419"/>
+        </w:rPr>
+        <w:t xml:space="preserve"> Site Pagado:</w:t>
+      </w:r>
+    </w:p>
+    <w:p>
+      <w:pPr>
+        <w:rPr>
+          <w:lang w:val="es-419"/>
+        </w:rPr>
+      </w:pPr>
+      <w:r>
+        <w:rPr>
+          <w:lang w:val="es-419"/>
+        </w:rPr>
+        <w:t>$</w:t>
+      </w:r>
+      <w:proofErr w:type="gramStart"/>
+      <w:r>
+        <w:rPr>
+          <w:lang w:val="es-419"/>
+        </w:rPr>
+        <w:t>XXX,XXX.XX</w:t>
+      </w:r>
+      <w:proofErr w:type="gramEnd"/>
+    </w:p>
+    <w:p>
+      <w:pPr>
+        <w:rPr>
+          <w:lang w:val="es-419"/>
+        </w:rPr>
+      </w:pPr>
+    </w:p>
+    <w:p>
+      <w:pPr>
+        <w:rPr>
+          <w:lang w:val="es-419"/>
+        </w:rPr>
+      </w:pPr>
+      <w:r>
+        <w:rPr>
+          <w:lang w:val="es-419"/>
+        </w:rPr>
+        <w:t>Balance Actual:</w:t>
+      </w:r>
+    </w:p>
+    <w:p>
+      <w:pPr>
+        <w:rPr>
+          <w:lang w:val="es-419"/>
+        </w:rPr>
+      </w:pPr>
+      <w:r>
+        <w:rPr>
+          <w:lang w:val="es-419"/>
+        </w:rPr>
+        <w:t>$</w:t>
+      </w:r>
+      <w:proofErr w:type="gramStart"/>
+      <w:r>
+        <w:rPr>
+          <w:lang w:val="es-419"/>
+        </w:rPr>
+        <w:t>X,XXX</w:t>
+      </w:r>
+      <w:proofErr w:type="gramEnd"/>
+      <w:r>
+        <w:rPr>
+          <w:lang w:val="es-419"/>
+        </w:rPr>
+        <w:t>,XXX.XX</w:t>
+      </w:r>
+    </w:p>
+    <w:p>
+      <w:pPr>
+        <w:rPr>
+          <w:lang w:val="es-419"/>
+        </w:rPr>
+      </w:pPr>
+    </w:p>
+    <w:p>
+      <w:pPr>
+        <w:rPr>
+          <w:lang w:val="es-419"/>
+        </w:rPr>
+      </w:pPr>
+      <w:r>
+        <w:rPr>
+          <w:lang w:val="es-419"/>
+        </w:rPr>
+        <w:t>## 6. Nuevo reporte: Resumen de Certificaciones</w:t>
+      </w:r>
+    </w:p>
+    <w:p>
+      <w:pPr>
+        <w:rPr>
+          <w:lang w:val="es-419"/>
+        </w:rPr>
+      </w:pPr>
+    </w:p>
+    <w:p>
+      <w:pPr>
+        <w:rPr>
+          <w:lang w:val="es-419"/>
+        </w:rPr>
+      </w:pPr>
+      <w:r>
+        <w:rPr>
+          <w:lang w:val="es-419"/>
+        </w:rPr>
+        <w:t>Crear un nuevo reporte llamado:</w:t>
+      </w:r>
+    </w:p>
+    <w:p>
+      <w:pPr>
+        <w:rPr>
+          <w:lang w:val="es-419"/>
+        </w:rPr>
+      </w:pPr>
+    </w:p>
+    <w:p>
+      <w:pPr>
+        <w:rPr>
+          <w:lang w:val="es-419"/>
+        </w:rPr>
+      </w:pPr>
+      <w:r>
+        <w:rPr>
+          <w:lang w:val="es-419"/>
+        </w:rPr>
+        <w:t>"Resumen de Certificaciones"</w:t>
+      </w:r>
+    </w:p>
+    <w:p>
+      <w:pPr>
+        <w:rPr>
+          <w:lang w:val="es-419"/>
+        </w:rPr>
+      </w:pPr>
+    </w:p>
+    <w:p>
+      <w:pPr>
+        <w:rPr>
+          <w:lang w:val="es-419"/>
+        </w:rPr>
+      </w:pPr>
+      <w:r>
+        <w:rPr>
+          <w:lang w:val="es-419"/>
+        </w:rPr>
+        <w:t>Objetivo:</w:t>
+      </w:r>
+    </w:p>
+    <w:p>
+      <w:pPr>
+        <w:rPr>
+          <w:lang w:val="es-419"/>
+        </w:rPr>
+      </w:pPr>
+      <w:r>
+        <w:rPr>
+          <w:lang w:val="es-419"/>
+        </w:rPr>
+        <w:t>Mostrar un consolidado de todas las certificaciones registradas hasta la fecha.</w:t>
+      </w:r>
+    </w:p>
+    <w:p>
+      <w:pPr>
+        <w:rPr>
+          <w:lang w:val="es-419"/>
+        </w:rPr>
+      </w:pPr>
+    </w:p>
+    <w:p>
+      <w:pPr>
+        <w:rPr>
+          <w:lang w:val="es-419"/>
+        </w:rPr>
+      </w:pPr>
+      <w:r>
+        <w:rPr>
+          <w:lang w:val="es-419"/>
+        </w:rPr>
+        <w:t>El reporte debe incluir al menos:</w:t>
+      </w:r>
+    </w:p>
+    <w:p>
+      <w:pPr>
+        <w:rPr>
+          <w:lang w:val="es-419"/>
+        </w:rPr>
+      </w:pPr>
+    </w:p>
+    <w:p>
+      <w:pPr>
+        <w:rPr>
+          <w:lang w:val="es-419"/>
+        </w:rPr>
+      </w:pPr>
+      <w:r>
+        <w:rPr>
+          <w:lang w:val="es-419"/>
+        </w:rPr>
+        <w:t>- Número de certificación</w:t>
+      </w:r>
+    </w:p>
+    <w:p>
+      <w:pPr>
+        <w:rPr>
+          <w:lang w:val="es-419"/>
+        </w:rPr>
+      </w:pPr>
+      <w:r>
+        <w:rPr>
+          <w:lang w:val="es-419"/>
+        </w:rPr>
+        <w:t>- Proyecto</w:t>
+      </w:r>
+    </w:p>
+    <w:p>
+      <w:pPr>
+        <w:rPr>
+          <w:lang w:val="es-419"/>
+        </w:rPr>
+      </w:pPr>
+      <w:r>
+        <w:rPr>
+          <w:lang w:val="es-419"/>
+        </w:rPr>
+        <w:t>- Contratista</w:t>
+      </w:r>
+    </w:p>
+    <w:p>
+      <w:pPr>
+        <w:rPr>
+          <w:lang w:val="es-419"/>
+        </w:rPr>
+      </w:pPr>
+      <w:r>
+        <w:rPr>
+          <w:lang w:val="es-419"/>
+        </w:rPr>
+        <w:t>- Fecha de certificación</w:t>
+      </w:r>
+    </w:p>
+    <w:p>
+      <w:pPr>
+        <w:rPr>
+          <w:lang w:val="es-419"/>
+        </w:rPr>
+      </w:pPr>
+      <w:r>
+        <w:rPr>
+          <w:lang w:val="es-419"/>
+        </w:rPr>
+        <w:t>- Monto certificado</w:t>
+      </w:r>
+    </w:p>
+    <w:p>
+      <w:pPr>
+        <w:rPr>
+          <w:lang w:val="es-419"/>
+        </w:rPr>
+      </w:pPr>
+      <w:r>
+        <w:rPr>
+          <w:lang w:val="es-419"/>
+        </w:rPr>
+        <w:t>- Monto pagado</w:t>
+      </w:r>
+    </w:p>
+    <w:p>
+      <w:pPr>
+        <w:rPr>
+          <w:lang w:val="es-419"/>
+        </w:rPr>
+      </w:pPr>
+      <w:r>
+        <w:rPr>
+          <w:lang w:val="es-419"/>
+        </w:rPr>
+        <w:t>- Balance pendiente</w:t>
+      </w:r>
+    </w:p>
+    <w:p>
+      <w:pPr>
+        <w:rPr>
+          <w:lang w:val="es-419"/>
+        </w:rPr>
+      </w:pPr>
+      <w:r>
+        <w:rPr>
+          <w:lang w:val="es-419"/>
+        </w:rPr>
+        <w:t>- Estado</w:t>
+      </w:r>
+    </w:p>
+    <w:p>
+      <w:pPr>
+        <w:rPr>
+          <w:lang w:val="es-419"/>
+        </w:rPr>
+      </w:pPr>
+      <w:r>
+        <w:rPr>
+          <w:lang w:val="es-419"/>
+        </w:rPr>
+        <w:t>- Indicador "Ya se pagó al contratista"</w:t>
+      </w:r>
+    </w:p>
+    <w:p>
+      <w:pPr>
+        <w:rPr>
+          <w:lang w:val="es-419"/>
+        </w:rPr>
+      </w:pPr>
+      <w:r>
+        <w:rPr>
+          <w:lang w:val="es-419"/>
+        </w:rPr>
+        <w:t>- Indicador "Excluir de resultados"</w:t>
+      </w:r>
+    </w:p>
+    <w:p>
+      <w:pPr>
+        <w:rPr>
+          <w:lang w:val="es-419"/>
+        </w:rPr>
+      </w:pPr>
+    </w:p>
     <w:p>
       <w:pPr>
         <w:rPr>
@@ -1215,641 +1936,6 @@
           <w:lang w:val="es-419"/>
         </w:rPr>
         <w:lastRenderedPageBreak/>
-        <w:t>Mostrar los siguientes valores:</w:t>
-      </w:r>
-    </w:p>
-    <w:p>
-      <w:pPr>
-        <w:rPr>
-          <w:lang w:val="es-419"/>
-        </w:rPr>
-      </w:pPr>
-    </w:p>
-    <w:p>
-      <w:pPr>
-        <w:rPr>
-          <w:lang w:val="es-419"/>
-        </w:rPr>
-      </w:pPr>
-      <w:r>
-        <w:rPr>
-          <w:lang w:val="es-419"/>
-        </w:rPr>
-        <w:t xml:space="preserve">1. Balance de Material </w:t>
-      </w:r>
-      <w:proofErr w:type="spellStart"/>
-      <w:r>
-        <w:rPr>
-          <w:lang w:val="es-419"/>
-        </w:rPr>
-        <w:t>On</w:t>
-      </w:r>
-      <w:proofErr w:type="spellEnd"/>
-      <w:r>
-        <w:rPr>
-          <w:lang w:val="es-419"/>
-        </w:rPr>
-        <w:t xml:space="preserve"> Site Pagado Hasta la Fecha</w:t>
-      </w:r>
-    </w:p>
-    <w:p>
-      <w:pPr>
-        <w:rPr>
-          <w:lang w:val="es-419"/>
-        </w:rPr>
-      </w:pPr>
-      <w:r>
-        <w:rPr>
-          <w:lang w:val="es-419"/>
-        </w:rPr>
-        <w:t xml:space="preserve">2. Último Material </w:t>
-      </w:r>
-      <w:proofErr w:type="spellStart"/>
-      <w:r>
-        <w:rPr>
-          <w:lang w:val="es-419"/>
-        </w:rPr>
-        <w:t>On</w:t>
-      </w:r>
-      <w:proofErr w:type="spellEnd"/>
-      <w:r>
-        <w:rPr>
-          <w:lang w:val="es-419"/>
-        </w:rPr>
-        <w:t xml:space="preserve"> Site Pagado</w:t>
-      </w:r>
-    </w:p>
-    <w:p>
-      <w:pPr>
-        <w:rPr>
-          <w:lang w:val="es-419"/>
-        </w:rPr>
-      </w:pPr>
-      <w:r>
-        <w:rPr>
-          <w:lang w:val="es-419"/>
-        </w:rPr>
-        <w:t xml:space="preserve">3. Balance Actual de Material </w:t>
-      </w:r>
-      <w:proofErr w:type="spellStart"/>
-      <w:r>
-        <w:rPr>
-          <w:lang w:val="es-419"/>
-        </w:rPr>
-        <w:t>On</w:t>
-      </w:r>
-      <w:proofErr w:type="spellEnd"/>
-      <w:r>
-        <w:rPr>
-          <w:lang w:val="es-419"/>
-        </w:rPr>
-        <w:t xml:space="preserve"> Site</w:t>
-      </w:r>
-    </w:p>
-    <w:p>
-      <w:pPr>
-        <w:rPr>
-          <w:lang w:val="es-419"/>
-        </w:rPr>
-      </w:pPr>
-    </w:p>
-    <w:p>
-      <w:pPr>
-        <w:rPr>
-          <w:lang w:val="es-419"/>
-        </w:rPr>
-      </w:pPr>
-      <w:r>
-        <w:rPr>
-          <w:lang w:val="es-419"/>
-        </w:rPr>
-        <w:t>Formato requerido:</w:t>
-      </w:r>
-    </w:p>
-    <w:p>
-      <w:pPr>
-        <w:rPr>
-          <w:lang w:val="es-419"/>
-        </w:rPr>
-      </w:pPr>
-      <w:r>
-        <w:rPr>
-          <w:lang w:val="es-419"/>
-        </w:rPr>
-        <w:t>- Mantener el mismo estilo visual del panel.</w:t>
-      </w:r>
-    </w:p>
-    <w:p>
-      <w:pPr>
-        <w:rPr>
-          <w:lang w:val="es-419"/>
-        </w:rPr>
-      </w:pPr>
-      <w:r>
-        <w:rPr>
-          <w:lang w:val="es-419"/>
-        </w:rPr>
-        <w:t>- Mostrar cantidades monetarias utilizando el formato actual del sistema.</w:t>
-      </w:r>
-    </w:p>
-    <w:p>
-      <w:pPr>
-        <w:rPr>
-          <w:lang w:val="es-419"/>
-        </w:rPr>
-      </w:pPr>
-      <w:r>
-        <w:rPr>
-          <w:lang w:val="es-419"/>
-        </w:rPr>
-        <w:t xml:space="preserve">- Incluir alineación y espaciado consistente con el resto de </w:t>
-      </w:r>
-      <w:proofErr w:type="gramStart"/>
-      <w:r>
-        <w:rPr>
-          <w:lang w:val="es-419"/>
-        </w:rPr>
-        <w:t>indicadores</w:t>
-      </w:r>
-      <w:proofErr w:type="gramEnd"/>
-      <w:r>
-        <w:rPr>
-          <w:lang w:val="es-419"/>
-        </w:rPr>
-        <w:t xml:space="preserve"> financieros.</w:t>
-      </w:r>
-    </w:p>
-    <w:p>
-      <w:pPr>
-        <w:rPr>
-          <w:lang w:val="es-419"/>
-        </w:rPr>
-      </w:pPr>
-    </w:p>
-    <w:p>
-      <w:pPr>
-        <w:rPr>
-          <w:lang w:val="es-419"/>
-        </w:rPr>
-      </w:pPr>
-      <w:r>
-        <w:rPr>
-          <w:lang w:val="es-419"/>
-        </w:rPr>
-        <w:t>Ejemplo de estructura visual:</w:t>
-      </w:r>
-    </w:p>
-    <w:p>
-      <w:pPr>
-        <w:rPr>
-          <w:lang w:val="es-419"/>
-        </w:rPr>
-      </w:pPr>
-    </w:p>
-    <w:p>
-      <w:pPr>
-        <w:rPr>
-          <w:lang w:val="es-419"/>
-        </w:rPr>
-      </w:pPr>
-      <w:r>
-        <w:rPr>
-          <w:lang w:val="es-419"/>
-        </w:rPr>
-        <w:t xml:space="preserve">Material </w:t>
-      </w:r>
-      <w:proofErr w:type="spellStart"/>
-      <w:r>
-        <w:rPr>
-          <w:lang w:val="es-419"/>
-        </w:rPr>
-        <w:t>On</w:t>
-      </w:r>
-      <w:proofErr w:type="spellEnd"/>
-      <w:r>
-        <w:rPr>
-          <w:lang w:val="es-419"/>
-        </w:rPr>
-        <w:t xml:space="preserve"> Site</w:t>
-      </w:r>
-    </w:p>
-    <w:p>
-      <w:pPr>
-        <w:rPr>
-          <w:lang w:val="es-419"/>
-        </w:rPr>
-      </w:pPr>
-    </w:p>
-    <w:p>
-      <w:pPr>
-        <w:rPr>
-          <w:lang w:val="es-419"/>
-        </w:rPr>
-      </w:pPr>
-      <w:r>
-        <w:rPr>
-          <w:lang w:val="es-419"/>
-        </w:rPr>
-        <w:t>Balance Pagado Hasta la Fecha:</w:t>
-      </w:r>
-    </w:p>
-    <w:p>
-      <w:pPr>
-        <w:rPr>
-          <w:lang w:val="es-419"/>
-        </w:rPr>
-      </w:pPr>
-      <w:r>
-        <w:rPr>
-          <w:lang w:val="es-419"/>
-        </w:rPr>
-        <w:t>$</w:t>
-      </w:r>
-      <w:proofErr w:type="gramStart"/>
-      <w:r>
-        <w:rPr>
-          <w:lang w:val="es-419"/>
-        </w:rPr>
-        <w:t>X,XXX</w:t>
-      </w:r>
-      <w:proofErr w:type="gramEnd"/>
-      <w:r>
-        <w:rPr>
-          <w:lang w:val="es-419"/>
-        </w:rPr>
-        <w:t>,XXX.XX</w:t>
-      </w:r>
-    </w:p>
-    <w:p>
-      <w:pPr>
-        <w:rPr>
-          <w:lang w:val="es-419"/>
-        </w:rPr>
-      </w:pPr>
-    </w:p>
-    <w:p>
-      <w:pPr>
-        <w:rPr>
-          <w:lang w:val="es-419"/>
-        </w:rPr>
-      </w:pPr>
-      <w:r>
-        <w:rPr>
-          <w:lang w:val="es-419"/>
-        </w:rPr>
-        <w:t xml:space="preserve">Último Material </w:t>
-      </w:r>
-      <w:proofErr w:type="spellStart"/>
-      <w:r>
-        <w:rPr>
-          <w:lang w:val="es-419"/>
-        </w:rPr>
-        <w:t>On</w:t>
-      </w:r>
-      <w:proofErr w:type="spellEnd"/>
-      <w:r>
-        <w:rPr>
-          <w:lang w:val="es-419"/>
-        </w:rPr>
-        <w:t xml:space="preserve"> Site Pagado:</w:t>
-      </w:r>
-    </w:p>
-    <w:p>
-      <w:pPr>
-        <w:rPr>
-          <w:lang w:val="es-419"/>
-        </w:rPr>
-      </w:pPr>
-      <w:r>
-        <w:rPr>
-          <w:lang w:val="es-419"/>
-        </w:rPr>
-        <w:t>$</w:t>
-      </w:r>
-      <w:proofErr w:type="gramStart"/>
-      <w:r>
-        <w:rPr>
-          <w:lang w:val="es-419"/>
-        </w:rPr>
-        <w:t>XXX,XXX.XX</w:t>
-      </w:r>
-      <w:proofErr w:type="gramEnd"/>
-    </w:p>
-    <w:p>
-      <w:pPr>
-        <w:rPr>
-          <w:lang w:val="es-419"/>
-        </w:rPr>
-      </w:pPr>
-    </w:p>
-    <w:p>
-      <w:pPr>
-        <w:rPr>
-          <w:lang w:val="es-419"/>
-        </w:rPr>
-      </w:pPr>
-      <w:r>
-        <w:rPr>
-          <w:lang w:val="es-419"/>
-        </w:rPr>
-        <w:t>Balance Actual:</w:t>
-      </w:r>
-    </w:p>
-    <w:p>
-      <w:pPr>
-        <w:rPr>
-          <w:lang w:val="es-419"/>
-        </w:rPr>
-      </w:pPr>
-      <w:r>
-        <w:rPr>
-          <w:lang w:val="es-419"/>
-        </w:rPr>
-        <w:t>$</w:t>
-      </w:r>
-      <w:proofErr w:type="gramStart"/>
-      <w:r>
-        <w:rPr>
-          <w:lang w:val="es-419"/>
-        </w:rPr>
-        <w:t>X,XXX</w:t>
-      </w:r>
-      <w:proofErr w:type="gramEnd"/>
-      <w:r>
-        <w:rPr>
-          <w:lang w:val="es-419"/>
-        </w:rPr>
-        <w:t>,XXX.XX</w:t>
-      </w:r>
-    </w:p>
-    <w:p>
-      <w:pPr>
-        <w:rPr>
-          <w:lang w:val="es-419"/>
-        </w:rPr>
-      </w:pPr>
-    </w:p>
-    <w:p>
-      <w:pPr>
-        <w:rPr>
-          <w:lang w:val="es-419"/>
-        </w:rPr>
-      </w:pPr>
-      <w:r>
-        <w:rPr>
-          <w:lang w:val="es-419"/>
-        </w:rPr>
-        <w:t>## 6. Nuevo reporte: Resumen de Certificaciones</w:t>
-      </w:r>
-    </w:p>
-    <w:p>
-      <w:pPr>
-        <w:rPr>
-          <w:lang w:val="es-419"/>
-        </w:rPr>
-      </w:pPr>
-    </w:p>
-    <w:p>
-      <w:pPr>
-        <w:rPr>
-          <w:lang w:val="es-419"/>
-        </w:rPr>
-      </w:pPr>
-      <w:r>
-        <w:rPr>
-          <w:lang w:val="es-419"/>
-        </w:rPr>
-        <w:lastRenderedPageBreak/>
-        <w:t>Crear un nuevo reporte llamado:</w:t>
-      </w:r>
-    </w:p>
-    <w:p>
-      <w:pPr>
-        <w:rPr>
-          <w:lang w:val="es-419"/>
-        </w:rPr>
-      </w:pPr>
-    </w:p>
-    <w:p>
-      <w:pPr>
-        <w:rPr>
-          <w:lang w:val="es-419"/>
-        </w:rPr>
-      </w:pPr>
-      <w:r>
-        <w:rPr>
-          <w:lang w:val="es-419"/>
-        </w:rPr>
-        <w:t>"Resumen de Certificaciones"</w:t>
-      </w:r>
-    </w:p>
-    <w:p>
-      <w:pPr>
-        <w:rPr>
-          <w:lang w:val="es-419"/>
-        </w:rPr>
-      </w:pPr>
-    </w:p>
-    <w:p>
-      <w:pPr>
-        <w:rPr>
-          <w:lang w:val="es-419"/>
-        </w:rPr>
-      </w:pPr>
-      <w:r>
-        <w:rPr>
-          <w:lang w:val="es-419"/>
-        </w:rPr>
-        <w:t>Objetivo:</w:t>
-      </w:r>
-    </w:p>
-    <w:p>
-      <w:pPr>
-        <w:rPr>
-          <w:lang w:val="es-419"/>
-        </w:rPr>
-      </w:pPr>
-      <w:r>
-        <w:rPr>
-          <w:lang w:val="es-419"/>
-        </w:rPr>
-        <w:t>Mostrar un consolidado de todas las certificaciones registradas hasta la fecha.</w:t>
-      </w:r>
-    </w:p>
-    <w:p>
-      <w:pPr>
-        <w:rPr>
-          <w:lang w:val="es-419"/>
-        </w:rPr>
-      </w:pPr>
-    </w:p>
-    <w:p>
-      <w:pPr>
-        <w:rPr>
-          <w:lang w:val="es-419"/>
-        </w:rPr>
-      </w:pPr>
-      <w:r>
-        <w:rPr>
-          <w:lang w:val="es-419"/>
-        </w:rPr>
-        <w:t>El reporte debe incluir al menos:</w:t>
-      </w:r>
-    </w:p>
-    <w:p>
-      <w:pPr>
-        <w:rPr>
-          <w:lang w:val="es-419"/>
-        </w:rPr>
-      </w:pPr>
-    </w:p>
-    <w:p>
-      <w:pPr>
-        <w:rPr>
-          <w:lang w:val="es-419"/>
-        </w:rPr>
-      </w:pPr>
-      <w:r>
-        <w:rPr>
-          <w:lang w:val="es-419"/>
-        </w:rPr>
-        <w:t>- Número de certificación</w:t>
-      </w:r>
-    </w:p>
-    <w:p>
-      <w:pPr>
-        <w:rPr>
-          <w:lang w:val="es-419"/>
-        </w:rPr>
-      </w:pPr>
-      <w:r>
-        <w:rPr>
-          <w:lang w:val="es-419"/>
-        </w:rPr>
-        <w:t>- Proyecto</w:t>
-      </w:r>
-    </w:p>
-    <w:p>
-      <w:pPr>
-        <w:rPr>
-          <w:lang w:val="es-419"/>
-        </w:rPr>
-      </w:pPr>
-      <w:r>
-        <w:rPr>
-          <w:lang w:val="es-419"/>
-        </w:rPr>
-        <w:t>- Contratista</w:t>
-      </w:r>
-    </w:p>
-    <w:p>
-      <w:pPr>
-        <w:rPr>
-          <w:lang w:val="es-419"/>
-        </w:rPr>
-      </w:pPr>
-      <w:r>
-        <w:rPr>
-          <w:lang w:val="es-419"/>
-        </w:rPr>
-        <w:t>- Fecha de certificación</w:t>
-      </w:r>
-    </w:p>
-    <w:p>
-      <w:pPr>
-        <w:rPr>
-          <w:lang w:val="es-419"/>
-        </w:rPr>
-      </w:pPr>
-      <w:r>
-        <w:rPr>
-          <w:lang w:val="es-419"/>
-        </w:rPr>
-        <w:t>- Monto certificado</w:t>
-      </w:r>
-    </w:p>
-    <w:p>
-      <w:pPr>
-        <w:rPr>
-          <w:lang w:val="es-419"/>
-        </w:rPr>
-      </w:pPr>
-      <w:r>
-        <w:rPr>
-          <w:lang w:val="es-419"/>
-        </w:rPr>
-        <w:t>- Monto pagado</w:t>
-      </w:r>
-    </w:p>
-    <w:p>
-      <w:pPr>
-        <w:rPr>
-          <w:lang w:val="es-419"/>
-        </w:rPr>
-      </w:pPr>
-      <w:r>
-        <w:rPr>
-          <w:lang w:val="es-419"/>
-        </w:rPr>
-        <w:t>- Balance pendiente</w:t>
-      </w:r>
-    </w:p>
-    <w:p>
-      <w:pPr>
-        <w:rPr>
-          <w:lang w:val="es-419"/>
-        </w:rPr>
-      </w:pPr>
-      <w:r>
-        <w:rPr>
-          <w:lang w:val="es-419"/>
-        </w:rPr>
-        <w:t>- Estado</w:t>
-      </w:r>
-    </w:p>
-    <w:p>
-      <w:pPr>
-        <w:rPr>
-          <w:lang w:val="es-419"/>
-        </w:rPr>
-      </w:pPr>
-      <w:r>
-        <w:rPr>
-          <w:lang w:val="es-419"/>
-        </w:rPr>
-        <w:t>- Indicador "Ya se pagó al contratista"</w:t>
-      </w:r>
-    </w:p>
-    <w:p>
-      <w:pPr>
-        <w:rPr>
-          <w:lang w:val="es-419"/>
-        </w:rPr>
-      </w:pPr>
-      <w:r>
-        <w:rPr>
-          <w:lang w:val="es-419"/>
-        </w:rPr>
-        <w:t>- Indicador "Excluir de resultados"</w:t>
-      </w:r>
-    </w:p>
-    <w:p>
-      <w:pPr>
-        <w:rPr>
-          <w:lang w:val="es-419"/>
-        </w:rPr>
-      </w:pPr>
-    </w:p>
-    <w:p>
-      <w:pPr>
-        <w:rPr>
-          <w:lang w:val="es-419"/>
-        </w:rPr>
-      </w:pPr>
-      <w:r>
-        <w:rPr>
-          <w:lang w:val="es-419"/>
-        </w:rPr>
         <w:t>Funcionalidades:</w:t>
       </w:r>
     </w:p>
@@ -2782,6 +2868,7 @@
   <w:style w:type="character" w:default="1" w:styleId="DefaultParagraphFont">
     <w:name w:val="Default Paragraph Font"/>
     <w:uiPriority w:val="1"/>
+    <w:semiHidden/>
     <w:unhideWhenUsed/>
   </w:style>
   <w:style w:type="table" w:default="1" w:styleId="TableNormal">

</xml_diff>